<commit_message>
Fast meny på alle undersider + omtrekking rettet
Co-Authored-By: Claude Opus 5 <noreply@anthropic.com>
</commit_message>
<xml_diff>
--- a/Okonomi-og-drift.docx
+++ b/Okonomi-og-drift.docx
@@ -2387,14 +2387,7 @@
           <w:b w:val="0"/>
           <w:i w:val="0"/>
         </w:rPr>
-        <w:t xml:space="preserve"> 4 000–8 000 kr per bord i Norge </w:t>
-      </w:r>
-      <w:r>
-        <w:rPr>
-          <w:b w:val="0"/>
-          <w:i/>
-        </w:rPr>
-        <w:t>(anslag, be om tilbud)</w:t>
+        <w:t xml:space="preserve"> De fleste klubbene trekker om selv, eller bruker en erfaren bordmontør fra miljøet. Spør en av de andre klubbene</w:t>
       </w:r>
     </w:p>
     <w:p>
@@ -2413,7 +2406,7 @@
           <w:b w:val="0"/>
           <w:i w:val="0"/>
         </w:rPr>
-        <w:t xml:space="preserve"> duk + montering delt på antall år</w:t>
+        <w:t xml:space="preserve"> duk, frakt og småmateriell delt på antall år</w:t>
       </w:r>
     </w:p>
     <w:p>
@@ -5266,14 +5259,14 @@
           <w:b/>
           <w:i w:val="0"/>
         </w:rPr>
-        <w:t>Omtrekking, flytting og oppretting i Norge:</w:t>
+        <w:t>Omtrekking, flytting og oppretting:</w:t>
       </w:r>
       <w:r>
         <w:rPr>
           <w:b w:val="0"/>
           <w:i w:val="0"/>
         </w:rPr>
-        <w:t xml:space="preserve"> Vi har ikke funnet publiserte priser. Be om tilbud fra minst to firma, for eksempel Biljardservice (Sandefjord) og Biljardexperten (Fetsund).</w:t>
+        <w:t xml:space="preserve"> Klubbene trekker som regel om selv, eller bruker en erfaren bordmontør fra snookermiljøet. Spør en av de andre klubbene hvem de bruker. Flytting av et skiferbord krever flere personer og riktig utstyr — ikke gjør det uten noen som har gjort det før.</w:t>
       </w:r>
     </w:p>
     <w:p>
@@ -5632,14 +5625,14 @@
           <w:b/>
           <w:i w:val="0"/>
         </w:rPr>
-        <w:t>Norske priser</w:t>
+        <w:t>Frakt av duk til Norge</w:t>
       </w:r>
       <w:r>
         <w:rPr>
           <w:b w:val="0"/>
           <w:i w:val="0"/>
         </w:rPr>
-        <w:t xml:space="preserve"> for duk, montering og flytting. Be om tilbud.</w:t>
+        <w:t>, med toll og moms. Sjekk før bestilling.</w:t>
       </w:r>
     </w:p>
     <w:p>

</xml_diff>

<commit_message>
Økonomi og drift 1.1: NBF-avgifter og låneordning
Co-Authored-By: Claude Opus 5 <noreply@anthropic.com>
</commit_message>
<xml_diff>
--- a/Okonomi-og-drift.docx
+++ b/Okonomi-og-drift.docx
@@ -39,7 +39,7 @@
           <w:color w:val="595959"/>
           <w:sz w:val="19"/>
         </w:rPr>
-        <w:t>Sist verifisert: 2026-09-16   ·   Status: v1 — priser og intervaller er delvis anslag   ·   Eier: Roger</w:t>
+        <w:t>Sist verifisert: 2026-09-17   ·   Status: v1 — priser og intervaller er delvis anslag   ·   Eier: Roger</w:t>
       </w:r>
     </w:p>
     <w:p>
@@ -126,7 +126,7 @@
             <w:color w:val="2F6B45"/>
             <w:sz w:val="21"/>
           </w:rPr>
-          <w:t xml:space="preserve">Vedlikehold av bordene</w:t>
+          <w:t xml:space="preserve">Avgifter til Norges Biljardforbund</w:t>
         </w:r>
       </w:hyperlink>
     </w:p>
@@ -141,7 +141,7 @@
             <w:color w:val="2F6B45"/>
             <w:sz w:val="21"/>
           </w:rPr>
-          <w:t xml:space="preserve">Sparing til nye bord</w:t>
+          <w:t xml:space="preserve">Vedlikehold av bordene</w:t>
         </w:r>
       </w:hyperlink>
     </w:p>
@@ -156,7 +156,7 @@
             <w:color w:val="2F6B45"/>
             <w:sz w:val="21"/>
           </w:rPr>
-          <w:t xml:space="preserve">Prisreferanse — bord, duk og utstyr</w:t>
+          <w:t xml:space="preserve">Sparing til nye bord</w:t>
         </w:r>
       </w:hyperlink>
     </w:p>
@@ -171,7 +171,7 @@
             <w:color w:val="2F6B45"/>
             <w:sz w:val="21"/>
           </w:rPr>
-          <w:t xml:space="preserve">Sjekkliste før årsmøtet</w:t>
+          <w:t xml:space="preserve">Prisreferanse — bord, duk og utstyr</w:t>
         </w:r>
       </w:hyperlink>
     </w:p>
@@ -186,6 +186,21 @@
             <w:color w:val="2F6B45"/>
             <w:sz w:val="21"/>
           </w:rPr>
+          <w:t xml:space="preserve">Sjekkliste før årsmøtet</w:t>
+        </w:r>
+      </w:hyperlink>
+    </w:p>
+    <w:p>
+      <w:pPr>
+        <w:spacing w:after="40" w:line="240" w:lineRule="auto"/>
+        <w:ind w:left="283"/>
+      </w:pPr>
+      <w:hyperlink w:anchor="ovs10">
+        <w:r>
+          <w:rPr>
+            <w:color w:val="2F6B45"/>
+            <w:sz w:val="21"/>
+          </w:rPr>
           <w:t xml:space="preserve">Dette må kontrolleres før klubben bygger på siden</w:t>
         </w:r>
       </w:hyperlink>
@@ -195,7 +210,7 @@
         <w:spacing w:after="40" w:line="240" w:lineRule="auto"/>
         <w:ind w:left="283"/>
       </w:pPr>
-      <w:hyperlink w:anchor="ovs10">
+      <w:hyperlink w:anchor="ovs11">
         <w:r>
           <w:rPr>
             <w:color w:val="2F6B45"/>
@@ -219,7 +234,7 @@
           <w:b/>
           <w:i w:val="0"/>
         </w:rPr>
-        <w:t>Versjon 1.0 — september 2026</w:t>
+        <w:t>Versjon 1.1 — september 2026</w:t>
       </w:r>
     </w:p>
     <w:tbl>
@@ -268,7 +283,7 @@
                 <w:i w:val="0"/>
                 <w:color w:val="14532D"/>
               </w:rPr>
-              <w:t xml:space="preserve">Reglene fra Idrettsforbundet er kontrollert mot kildene 16. september 2026. </w:t>
+              <w:t xml:space="preserve">Reglene fra Idrettsforbundet er kontrollert mot kildene 16. september 2026. Avgiftene og låneordningen i Norges Biljardforbund er bekreftet av forbundskontoret 17. september 2026. </w:t>
             </w:r>
             <w:r>
               <w:rPr>
@@ -2285,6 +2300,580 @@
       </w:pPr>
     </w:p>
     <w:p>
+      <w:bookmarkStart w:id="1004" w:name="ovs5"/>
+      <w:pPr>
+        <w:pStyle w:val="Heading2"/>
+        <w:pBdr>
+          <w:bottom w:val="single" w:sz="4" w:space="4" w:color="C6D9CC"/>
+        </w:pBdr>
+      </w:pPr>
+      <w:r>
+        <w:rPr>
+          <w:b/>
+          <w:i w:val="0"/>
+          <w:color w:val="1F7A4D"/>
+          <w:sz w:val="28"/>
+        </w:rPr>
+        <w:t>Avgifter til Norges Biljardforbund</w:t>
+      </w:r>
+      <w:bookmarkEnd w:id="1004"/>
+    </w:p>
+    <w:p>
+      <w:pPr>
+        <w:pStyle w:val="Heading3"/>
+      </w:pPr>
+      <w:r>
+        <w:rPr>
+          <w:b/>
+          <w:i w:val="0"/>
+          <w:color w:val="2F6B45"/>
+          <w:sz w:val="24"/>
+        </w:rPr>
+        <w:t>Klubbkontingent</w:t>
+      </w:r>
+    </w:p>
+    <w:p>
+      <w:r>
+        <w:rPr>
+          <w:b w:val="0"/>
+          <w:i w:val="0"/>
+        </w:rPr>
+        <w:t>Klubben betaler én kontingent i året til forbundet. Den regnes etter antall medlemmer, ikke per medlem.</w:t>
+      </w:r>
+    </w:p>
+    <w:tbl>
+      <w:tblPr>
+        <w:tblStyle w:val="TableGrid"/>
+        <w:tblW w:type="auto" w:w="0"/>
+        <w:jc w:val="left"/>
+        <w:tblLook w:firstColumn="1" w:firstRow="1" w:lastColumn="0" w:lastRow="0" w:noHBand="0" w:noVBand="1" w:val="04A0"/>
+        <w:tblBorders>
+          <w:top w:val="single" w:sz="8" w:space="0" w:color="3A6B4A"/>
+          <w:left w:val="single" w:sz="4" w:space="0" w:color="3A6B4A"/>
+          <w:bottom w:val="single" w:sz="8" w:space="0" w:color="3A6B4A"/>
+          <w:right w:val="single" w:sz="4" w:space="0" w:color="3A6B4A"/>
+          <w:insideH w:val="single" w:sz="4" w:space="0" w:color="3A6B4A"/>
+          <w:insideV w:val="single" w:sz="4" w:space="0" w:color="3A6B4A"/>
+        </w:tblBorders>
+      </w:tblPr>
+      <w:tblGrid>
+        <w:gridCol w:w="4536"/>
+        <w:gridCol w:w="4536"/>
+      </w:tblGrid>
+      <w:tr>
+        <w:trPr>
+          <w:cantSplit/>
+          <w:tblHeader w:val="true"/>
+        </w:trPr>
+        <w:tc>
+          <w:tcPr>
+            <w:tcW w:type="dxa" w:w="4536"/>
+            <w:shd w:val="clear" w:color="auto" w:fill="E9F2EC"/>
+          </w:tcPr>
+          <w:p>
+            <w:pPr>
+              <w:spacing w:before="60" w:after="60"/>
+            </w:pPr>
+            <w:r>
+              <w:rPr>
+                <w:b/>
+              </w:rPr>
+            </w:r>
+            <w:r>
+              <w:rPr>
+                <w:b/>
+                <w:i w:val="0"/>
+                <w:color w:val="14532D"/>
+                <w:sz w:val="21"/>
+              </w:rPr>
+              <w:t>Medlemmer i klubben</w:t>
+            </w:r>
+          </w:p>
+        </w:tc>
+        <w:tc>
+          <w:tcPr>
+            <w:tcW w:type="dxa" w:w="4536"/>
+            <w:shd w:val="clear" w:color="auto" w:fill="E9F2EC"/>
+          </w:tcPr>
+          <w:p>
+            <w:pPr>
+              <w:spacing w:before="60" w:after="60"/>
+            </w:pPr>
+            <w:r>
+              <w:rPr>
+                <w:b/>
+              </w:rPr>
+            </w:r>
+            <w:r>
+              <w:rPr>
+                <w:b/>
+                <w:i w:val="0"/>
+                <w:color w:val="14532D"/>
+                <w:sz w:val="21"/>
+              </w:rPr>
+              <w:t>Per år</w:t>
+            </w:r>
+          </w:p>
+        </w:tc>
+      </w:tr>
+      <w:tr>
+        <w:trPr>
+          <w:cantSplit/>
+        </w:trPr>
+        <w:tc>
+          <w:tcPr>
+            <w:tcW w:type="dxa" w:w="4536"/>
+          </w:tcPr>
+          <w:p>
+            <w:pPr>
+              <w:spacing w:before="60" w:after="60"/>
+            </w:pPr>
+            <w:r>
+              <w:rPr>
+                <w:sz w:val="21"/>
+              </w:rPr>
+            </w:r>
+            <w:r>
+              <w:rPr>
+                <w:b w:val="0"/>
+                <w:i w:val="0"/>
+                <w:sz w:val="21"/>
+              </w:rPr>
+              <w:t>Under 100</w:t>
+            </w:r>
+          </w:p>
+        </w:tc>
+        <w:tc>
+          <w:tcPr>
+            <w:tcW w:type="dxa" w:w="4536"/>
+          </w:tcPr>
+          <w:p>
+            <w:pPr>
+              <w:spacing w:before="60" w:after="60"/>
+            </w:pPr>
+            <w:r>
+              <w:rPr>
+                <w:sz w:val="21"/>
+              </w:rPr>
+            </w:r>
+            <w:r>
+              <w:rPr>
+                <w:b w:val="0"/>
+                <w:i w:val="0"/>
+                <w:sz w:val="21"/>
+              </w:rPr>
+              <w:t>3 000 kr</w:t>
+            </w:r>
+          </w:p>
+        </w:tc>
+      </w:tr>
+      <w:tr>
+        <w:trPr>
+          <w:cantSplit/>
+        </w:trPr>
+        <w:tc>
+          <w:tcPr>
+            <w:tcW w:type="dxa" w:w="4536"/>
+            <w:shd w:val="clear" w:color="auto" w:fill="F5F9F6"/>
+          </w:tcPr>
+          <w:p>
+            <w:pPr>
+              <w:spacing w:before="60" w:after="60"/>
+            </w:pPr>
+            <w:r>
+              <w:rPr>
+                <w:sz w:val="21"/>
+              </w:rPr>
+            </w:r>
+            <w:r>
+              <w:rPr>
+                <w:b w:val="0"/>
+                <w:i w:val="0"/>
+                <w:sz w:val="21"/>
+              </w:rPr>
+              <w:t>100 eller flere</w:t>
+            </w:r>
+          </w:p>
+        </w:tc>
+        <w:tc>
+          <w:tcPr>
+            <w:tcW w:type="dxa" w:w="4536"/>
+            <w:shd w:val="clear" w:color="auto" w:fill="F5F9F6"/>
+          </w:tcPr>
+          <w:p>
+            <w:pPr>
+              <w:spacing w:before="60" w:after="60"/>
+            </w:pPr>
+            <w:r>
+              <w:rPr>
+                <w:sz w:val="21"/>
+              </w:rPr>
+            </w:r>
+            <w:r>
+              <w:rPr>
+                <w:b w:val="0"/>
+                <w:i w:val="0"/>
+                <w:sz w:val="21"/>
+              </w:rPr>
+              <w:t>4 000 kr</w:t>
+            </w:r>
+          </w:p>
+        </w:tc>
+      </w:tr>
+    </w:tbl>
+    <w:p>
+      <w:pPr>
+        <w:spacing w:after="120"/>
+      </w:pPr>
+    </w:p>
+    <w:p>
+      <w:r>
+        <w:rPr>
+          <w:b w:val="0"/>
+          <w:i w:val="0"/>
+        </w:rPr>
+        <w:t>Beløpene er oppgitt av forbundskontoret 17. september 2026. Turneringsbestemmelsene (TBR 12.3.2) viste samme dag fortsatt 2 000 og 3 000 kr.</w:t>
+      </w:r>
+    </w:p>
+    <w:p>
+      <w:pPr>
+        <w:pStyle w:val="Heading3"/>
+      </w:pPr>
+      <w:r>
+        <w:rPr>
+          <w:b/>
+          <w:i w:val="0"/>
+          <w:color w:val="2F6B45"/>
+          <w:sz w:val="24"/>
+        </w:rPr>
+        <w:t>Lisens for spillere</w:t>
+      </w:r>
+    </w:p>
+    <w:p>
+      <w:r>
+        <w:rPr>
+          <w:b w:val="0"/>
+          <w:i w:val="0"/>
+        </w:rPr>
+        <w:t>Lisensen trengs for å spille turneringer.</w:t>
+      </w:r>
+    </w:p>
+    <w:tbl>
+      <w:tblPr>
+        <w:tblStyle w:val="TableGrid"/>
+        <w:tblW w:type="auto" w:w="0"/>
+        <w:jc w:val="left"/>
+        <w:tblLook w:firstColumn="1" w:firstRow="1" w:lastColumn="0" w:lastRow="0" w:noHBand="0" w:noVBand="1" w:val="04A0"/>
+        <w:tblBorders>
+          <w:top w:val="single" w:sz="8" w:space="0" w:color="3A6B4A"/>
+          <w:left w:val="single" w:sz="4" w:space="0" w:color="3A6B4A"/>
+          <w:bottom w:val="single" w:sz="8" w:space="0" w:color="3A6B4A"/>
+          <w:right w:val="single" w:sz="4" w:space="0" w:color="3A6B4A"/>
+          <w:insideH w:val="single" w:sz="4" w:space="0" w:color="3A6B4A"/>
+          <w:insideV w:val="single" w:sz="4" w:space="0" w:color="3A6B4A"/>
+        </w:tblBorders>
+      </w:tblPr>
+      <w:tblGrid>
+        <w:gridCol w:w="4536"/>
+        <w:gridCol w:w="4536"/>
+      </w:tblGrid>
+      <w:tr>
+        <w:trPr>
+          <w:cantSplit/>
+          <w:tblHeader w:val="true"/>
+        </w:trPr>
+        <w:tc>
+          <w:tcPr>
+            <w:tcW w:type="dxa" w:w="4536"/>
+            <w:shd w:val="clear" w:color="auto" w:fill="E9F2EC"/>
+          </w:tcPr>
+          <w:p>
+            <w:pPr>
+              <w:spacing w:before="60" w:after="60"/>
+            </w:pPr>
+            <w:r>
+              <w:rPr>
+                <w:b/>
+              </w:rPr>
+            </w:r>
+            <w:r>
+              <w:rPr>
+                <w:b/>
+                <w:i w:val="0"/>
+                <w:color w:val="14532D"/>
+                <w:sz w:val="21"/>
+              </w:rPr>
+              <w:t>Lisens</w:t>
+            </w:r>
+          </w:p>
+        </w:tc>
+        <w:tc>
+          <w:tcPr>
+            <w:tcW w:type="dxa" w:w="4536"/>
+            <w:shd w:val="clear" w:color="auto" w:fill="E9F2EC"/>
+          </w:tcPr>
+          <w:p>
+            <w:pPr>
+              <w:spacing w:before="60" w:after="60"/>
+            </w:pPr>
+            <w:r>
+              <w:rPr>
+                <w:b/>
+              </w:rPr>
+            </w:r>
+            <w:r>
+              <w:rPr>
+                <w:b/>
+                <w:i w:val="0"/>
+                <w:color w:val="14532D"/>
+                <w:sz w:val="21"/>
+              </w:rPr>
+              <w:t>Per sesong</w:t>
+            </w:r>
+          </w:p>
+        </w:tc>
+      </w:tr>
+      <w:tr>
+        <w:trPr>
+          <w:cantSplit/>
+        </w:trPr>
+        <w:tc>
+          <w:tcPr>
+            <w:tcW w:type="dxa" w:w="4536"/>
+          </w:tcPr>
+          <w:p>
+            <w:pPr>
+              <w:spacing w:before="60" w:after="60"/>
+            </w:pPr>
+            <w:r>
+              <w:rPr>
+                <w:sz w:val="21"/>
+              </w:rPr>
+            </w:r>
+            <w:r>
+              <w:rPr>
+                <w:b w:val="0"/>
+                <w:i w:val="0"/>
+                <w:sz w:val="21"/>
+              </w:rPr>
+              <w:t>A-lisens, senior</w:t>
+            </w:r>
+          </w:p>
+        </w:tc>
+        <w:tc>
+          <w:tcPr>
+            <w:tcW w:type="dxa" w:w="4536"/>
+          </w:tcPr>
+          <w:p>
+            <w:pPr>
+              <w:spacing w:before="60" w:after="60"/>
+            </w:pPr>
+            <w:r>
+              <w:rPr>
+                <w:sz w:val="21"/>
+              </w:rPr>
+            </w:r>
+            <w:r>
+              <w:rPr>
+                <w:b w:val="0"/>
+                <w:i w:val="0"/>
+                <w:sz w:val="21"/>
+              </w:rPr>
+              <w:t>400 kr</w:t>
+            </w:r>
+          </w:p>
+        </w:tc>
+      </w:tr>
+      <w:tr>
+        <w:trPr>
+          <w:cantSplit/>
+        </w:trPr>
+        <w:tc>
+          <w:tcPr>
+            <w:tcW w:type="dxa" w:w="4536"/>
+            <w:shd w:val="clear" w:color="auto" w:fill="F5F9F6"/>
+          </w:tcPr>
+          <w:p>
+            <w:pPr>
+              <w:spacing w:before="60" w:after="60"/>
+            </w:pPr>
+            <w:r>
+              <w:rPr>
+                <w:sz w:val="21"/>
+              </w:rPr>
+            </w:r>
+            <w:r>
+              <w:rPr>
+                <w:b w:val="0"/>
+                <w:i w:val="0"/>
+                <w:sz w:val="21"/>
+              </w:rPr>
+              <w:t>B-lisens, junior</w:t>
+            </w:r>
+          </w:p>
+        </w:tc>
+        <w:tc>
+          <w:tcPr>
+            <w:tcW w:type="dxa" w:w="4536"/>
+            <w:shd w:val="clear" w:color="auto" w:fill="F5F9F6"/>
+          </w:tcPr>
+          <w:p>
+            <w:pPr>
+              <w:spacing w:before="60" w:after="60"/>
+            </w:pPr>
+            <w:r>
+              <w:rPr>
+                <w:sz w:val="21"/>
+              </w:rPr>
+            </w:r>
+            <w:r>
+              <w:rPr>
+                <w:b w:val="0"/>
+                <w:i w:val="0"/>
+                <w:sz w:val="21"/>
+              </w:rPr>
+              <w:t>50 kr</w:t>
+            </w:r>
+          </w:p>
+        </w:tc>
+      </w:tr>
+      <w:tr>
+        <w:trPr>
+          <w:cantSplit/>
+        </w:trPr>
+        <w:tc>
+          <w:tcPr>
+            <w:tcW w:type="dxa" w:w="4536"/>
+          </w:tcPr>
+          <w:p>
+            <w:pPr>
+              <w:spacing w:before="60" w:after="60"/>
+            </w:pPr>
+            <w:r>
+              <w:rPr>
+                <w:sz w:val="21"/>
+              </w:rPr>
+            </w:r>
+            <w:r>
+              <w:rPr>
+                <w:b w:val="0"/>
+                <w:i w:val="0"/>
+                <w:sz w:val="21"/>
+              </w:rPr>
+              <w:t>D-lisens, engangslisens for senior</w:t>
+            </w:r>
+          </w:p>
+        </w:tc>
+        <w:tc>
+          <w:tcPr>
+            <w:tcW w:type="dxa" w:w="4536"/>
+          </w:tcPr>
+          <w:p>
+            <w:pPr>
+              <w:spacing w:before="60" w:after="60"/>
+            </w:pPr>
+            <w:r>
+              <w:rPr>
+                <w:sz w:val="21"/>
+              </w:rPr>
+            </w:r>
+            <w:r>
+              <w:rPr>
+                <w:b w:val="0"/>
+                <w:i w:val="0"/>
+                <w:sz w:val="21"/>
+              </w:rPr>
+              <w:t>200 kr</w:t>
+            </w:r>
+          </w:p>
+        </w:tc>
+      </w:tr>
+      <w:tr>
+        <w:trPr>
+          <w:cantSplit/>
+        </w:trPr>
+        <w:tc>
+          <w:tcPr>
+            <w:tcW w:type="dxa" w:w="4536"/>
+            <w:shd w:val="clear" w:color="auto" w:fill="F5F9F6"/>
+          </w:tcPr>
+          <w:p>
+            <w:pPr>
+              <w:spacing w:before="60" w:after="60"/>
+            </w:pPr>
+            <w:r>
+              <w:rPr>
+                <w:sz w:val="21"/>
+              </w:rPr>
+            </w:r>
+            <w:r>
+              <w:rPr>
+                <w:b w:val="0"/>
+                <w:i w:val="0"/>
+                <w:sz w:val="21"/>
+              </w:rPr>
+              <w:t>E-lisens, oppgradering fra D til A</w:t>
+            </w:r>
+          </w:p>
+        </w:tc>
+        <w:tc>
+          <w:tcPr>
+            <w:tcW w:type="dxa" w:w="4536"/>
+            <w:shd w:val="clear" w:color="auto" w:fill="F5F9F6"/>
+          </w:tcPr>
+          <w:p>
+            <w:pPr>
+              <w:spacing w:before="60" w:after="60"/>
+            </w:pPr>
+            <w:r>
+              <w:rPr>
+                <w:sz w:val="21"/>
+              </w:rPr>
+            </w:r>
+            <w:r>
+              <w:rPr>
+                <w:b w:val="0"/>
+                <w:i w:val="0"/>
+                <w:sz w:val="21"/>
+              </w:rPr>
+              <w:t>300 kr</w:t>
+            </w:r>
+          </w:p>
+        </w:tc>
+      </w:tr>
+    </w:tbl>
+    <w:p>
+      <w:pPr>
+        <w:spacing w:after="120"/>
+      </w:pPr>
+    </w:p>
+    <w:p>
+      <w:r>
+        <w:rPr>
+          <w:b w:val="0"/>
+          <w:i w:val="0"/>
+        </w:rPr>
+        <w:t>Sesongen 2026/27 er lengre enn vanlig. Lisensen krever inn én gang per kalenderår: ved påmelding til første turnering høsten 2026, og igjen ved første turnering i 2027. Kilde: TBR 12.1.1.</w:t>
+      </w:r>
+    </w:p>
+    <w:p>
+      <w:r>
+        <w:rPr>
+          <w:b w:val="0"/>
+          <w:i w:val="0"/>
+        </w:rPr>
+        <w:t>En klubb uten turneringsspillere betaler altså bare klubbkontingenten.</w:t>
+      </w:r>
+    </w:p>
+    <w:p>
+      <w:pPr>
+        <w:spacing w:before="120" w:after="200"/>
+        <w:pBdr>
+          <w:bottom w:val="single" w:sz="4" w:space="4" w:color="C6D9CC"/>
+        </w:pBdr>
+      </w:pPr>
+    </w:p>
+    <w:p>
       <w:r>
         <w:rPr>
           <w:b w:val="0"/>
@@ -2294,7 +2883,7 @@
       </w:r>
     </w:p>
     <w:p>
-      <w:bookmarkStart w:id="1004" w:name="ovs5"/>
+      <w:bookmarkStart w:id="1005" w:name="ovs6"/>
       <w:pPr>
         <w:pStyle w:val="Heading2"/>
         <w:pBdr>
@@ -2310,7 +2899,7 @@
         </w:rPr>
         <w:t>Vedlikehold av bordene</w:t>
       </w:r>
-      <w:bookmarkEnd w:id="1004"/>
+      <w:bookmarkEnd w:id="1005"/>
     </w:p>
     <w:p>
       <w:pPr>
@@ -2652,7 +3241,7 @@
       </w:pPr>
     </w:p>
     <w:p>
-      <w:bookmarkStart w:id="1005" w:name="ovs6"/>
+      <w:bookmarkStart w:id="1006" w:name="ovs7"/>
       <w:pPr>
         <w:pStyle w:val="Heading2"/>
         <w:pBdr>
@@ -2668,7 +3257,7 @@
         </w:rPr>
         <w:t>Sparing til nye bord</w:t>
       </w:r>
-      <w:bookmarkEnd w:id="1005"/>
+      <w:bookmarkEnd w:id="1006"/>
     </w:p>
     <w:p>
       <w:r>
@@ -2792,28 +3381,47 @@
           <w:b/>
           <w:i w:val="0"/>
         </w:rPr>
-        <w:t>Norges Biljardforbund</w:t>
+        <w:t>Norges Biljardforbund har rentefritt lån til bord.</w:t>
       </w:r>
       <w:r>
         <w:rPr>
           <w:b w:val="0"/>
           <w:i w:val="0"/>
         </w:rPr>
-        <w:t xml:space="preserve"> har tidligere gitt en klubb driftslån etter styrevedtak, men vi har </w:t>
+        <w:t xml:space="preserve"> Lånet gjelder bare kjøp av nye eller brukte bord, og utstyr til dem. Forbundsstyret behandler hver søknad og tar alltid pant i bordene. Lånet betales ned over </w:t>
       </w:r>
       <w:r>
         <w:rPr>
           <w:b/>
           <w:i w:val="0"/>
         </w:rPr>
-        <w:t>ikke funnet noen fast låneordning</w:t>
+        <w:t>høyst tre år</w:t>
       </w:r>
       <w:r>
         <w:rPr>
           <w:b w:val="0"/>
           <w:i w:val="0"/>
         </w:rPr>
-        <w:t>. Spør forbundskontoret.</w:t>
+        <w:t>, og det gis bare når forbundet har egenkapital til det. Jo større egenandel klubben stiller med, jo større er sjansen.</w:t>
+      </w:r>
+    </w:p>
+    <w:p>
+      <w:pPr>
+        <w:pStyle w:val="ListBullet"/>
+      </w:pPr>
+      <w:r>
+        <w:rPr>
+          <w:b/>
+          <w:i w:val="0"/>
+        </w:rPr>
+        <w:t>Søknaden til forbundet skal ha med:</w:t>
+      </w:r>
+      <w:r>
+        <w:rPr>
+          <w:b w:val="0"/>
+          <w:i w:val="0"/>
+        </w:rPr>
+        <w:t xml:space="preserve"> siste årsregnskap, budsjett for i år og neste år med nedbetalingen inne, hva som skal kjøpes med priser, og ønsket nedbetalingsplan.</w:t>
       </w:r>
     </w:p>
     <w:p>
@@ -2863,7 +3471,7 @@
       </w:pPr>
     </w:p>
     <w:p>
-      <w:bookmarkStart w:id="1006" w:name="ovs7"/>
+      <w:bookmarkStart w:id="1007" w:name="ovs8"/>
       <w:pPr>
         <w:pStyle w:val="Heading2"/>
         <w:pBdr>
@@ -2879,7 +3487,7 @@
         </w:rPr>
         <w:t>Prisreferanse — bord, duk og utstyr</w:t>
       </w:r>
-      <w:bookmarkEnd w:id="1006"/>
+      <w:bookmarkEnd w:id="1007"/>
     </w:p>
     <w:p>
       <w:r>
@@ -5278,7 +5886,7 @@
       </w:pPr>
     </w:p>
     <w:p>
-      <w:bookmarkStart w:id="1007" w:name="ovs8"/>
+      <w:bookmarkStart w:id="1008" w:name="ovs9"/>
       <w:pPr>
         <w:pStyle w:val="Heading2"/>
         <w:pBdr>
@@ -5294,7 +5902,7 @@
         </w:rPr>
         <w:t>Sjekkliste før årsmøtet</w:t>
       </w:r>
-      <w:bookmarkEnd w:id="1007"/>
+      <w:bookmarkEnd w:id="1008"/>
     </w:p>
     <w:p>
       <w:pPr>
@@ -5548,7 +6156,7 @@
       </w:pPr>
     </w:p>
     <w:p>
-      <w:bookmarkStart w:id="1008" w:name="ovs9"/>
+      <w:bookmarkStart w:id="1009" w:name="ovs10"/>
       <w:pPr>
         <w:pStyle w:val="Heading2"/>
         <w:pBdr>
@@ -5564,7 +6172,7 @@
         </w:rPr>
         <w:t>Dette må kontrolleres før klubben bygger på siden</w:t>
       </w:r>
-      <w:bookmarkEnd w:id="1008"/>
+      <w:bookmarkEnd w:id="1009"/>
     </w:p>
     <w:p>
       <w:pPr>
@@ -5579,14 +6187,14 @@
           <w:b/>
           <w:i w:val="0"/>
         </w:rPr>
-        <w:t>Lisenspris og avgifter i Norges Biljardforbund</w:t>
+        <w:t>Klubbkontingenten til forbundet.</w:t>
       </w:r>
       <w:r>
         <w:rPr>
           <w:b w:val="0"/>
           <w:i w:val="0"/>
         </w:rPr>
-        <w:t xml:space="preserve"> for 2026–2027. Ikke funnet. Spør forbundskontoret.</w:t>
+        <w:t xml:space="preserve"> Forbundskontoret og TBR oppgir ulike beløp. Sjekk fakturaen klubben har fått.</w:t>
       </w:r>
     </w:p>
     <w:p>
@@ -5602,14 +6210,14 @@
           <w:b/>
           <w:i w:val="0"/>
         </w:rPr>
-        <w:t>Om forbundet har en låneordning</w:t>
+        <w:t>Om forbundet har egenkapital til nye lån</w:t>
       </w:r>
       <w:r>
         <w:rPr>
           <w:b w:val="0"/>
           <w:i w:val="0"/>
         </w:rPr>
-        <w:t xml:space="preserve"> i dag.</w:t>
+        <w:t xml:space="preserve"> det året klubben søker.</w:t>
       </w:r>
     </w:p>
     <w:p>
@@ -5713,7 +6321,7 @@
       </w:pPr>
     </w:p>
     <w:p>
-      <w:bookmarkStart w:id="1009" w:name="ovs10"/>
+      <w:bookmarkStart w:id="1010" w:name="ovs11"/>
       <w:pPr>
         <w:pStyle w:val="Heading2"/>
         <w:pBdr>
@@ -5729,7 +6337,7 @@
         </w:rPr>
         <w:t>Kilder</w:t>
       </w:r>
-      <w:bookmarkEnd w:id="1009"/>
+      <w:bookmarkEnd w:id="1010"/>
     </w:p>
     <w:p>
       <w:pPr>
@@ -5853,7 +6461,7 @@
             <w:u w:val="single"/>
             <w:color w:val="1F7A4D"/>
           </w:rPr>
-          <w:t xml:space="preserve">Riley: 12-fots bord</w:t>
+          <w:t xml:space="preserve">NBF: TBR 12.1.1 Lisensavgifter</w:t>
         </w:r>
       </w:hyperlink>
     </w:p>
@@ -5867,6 +6475,46 @@
             <w:u w:val="single"/>
             <w:color w:val="1F7A4D"/>
           </w:rPr>
+          <w:t xml:space="preserve">NBF: TBR 12.3.2 Klubb, i regionalt forbund og NB</w:t>
+        </w:r>
+      </w:hyperlink>
+    </w:p>
+    <w:p>
+      <w:pPr>
+        <w:pStyle w:val="ListBullet"/>
+      </w:pPr>
+      <w:r>
+        <w:rPr>
+          <w:b w:val="0"/>
+          <w:i w:val="0"/>
+        </w:rPr>
+        <w:t>Norges Biljardforbund, generalsekretær: e-post 17. september 2026 om klubbkontingent og lån</w:t>
+      </w:r>
+    </w:p>
+    <w:p>
+      <w:pPr>
+        <w:pStyle w:val="ListBullet"/>
+      </w:pPr>
+      <w:hyperlink r:id="rId22">
+        <w:r>
+          <w:rPr>
+            <w:u w:val="single"/>
+            <w:color w:val="1F7A4D"/>
+          </w:rPr>
+          <w:t xml:space="preserve">Riley: 12-fots bord</w:t>
+        </w:r>
+      </w:hyperlink>
+    </w:p>
+    <w:p>
+      <w:pPr>
+        <w:pStyle w:val="ListBullet"/>
+      </w:pPr>
+      <w:hyperlink r:id="rId23">
+        <w:r>
+          <w:rPr>
+            <w:u w:val="single"/>
+            <w:color w:val="1F7A4D"/>
+          </w:rPr>
           <w:t xml:space="preserve">Cue and Case: Hainsworth-duk</w:t>
         </w:r>
       </w:hyperlink>
@@ -5875,7 +6523,7 @@
       <w:pPr>
         <w:pStyle w:val="ListBullet"/>
       </w:pPr>
-      <w:hyperlink r:id="rId22">
+      <w:hyperlink r:id="rId24">
         <w:r>
           <w:rPr>
             <w:u w:val="single"/>
@@ -5889,7 +6537,7 @@
       <w:pPr>
         <w:pStyle w:val="ListBullet"/>
       </w:pPr>
-      <w:hyperlink r:id="rId23">
+      <w:hyperlink r:id="rId25">
         <w:r>
           <w:rPr>
             <w:u w:val="single"/>

</xml_diff>

<commit_message>
Økonomi og drift 1.2: riktig klubbkontingent
Co-Authored-By: Claude Opus 5 <noreply@anthropic.com>
</commit_message>
<xml_diff>
--- a/Okonomi-og-drift.docx
+++ b/Okonomi-og-drift.docx
@@ -234,7 +234,7 @@
           <w:b/>
           <w:i w:val="0"/>
         </w:rPr>
-        <w:t>Versjon 1.1 — september 2026</w:t>
+        <w:t>Versjon 1.2 — september 2026</w:t>
       </w:r>
     </w:p>
     <w:tbl>
@@ -2462,7 +2462,7 @@
                 <w:i w:val="0"/>
                 <w:sz w:val="21"/>
               </w:rPr>
-              <w:t>3 000 kr</w:t>
+              <w:t>2 000 kr</w:t>
             </w:r>
           </w:p>
         </w:tc>
@@ -2515,7 +2515,7 @@
                 <w:i w:val="0"/>
                 <w:sz w:val="21"/>
               </w:rPr>
-              <w:t>4 000 kr</w:t>
+              <w:t>3 000 kr</w:t>
             </w:r>
           </w:p>
         </w:tc>
@@ -2532,7 +2532,7 @@
           <w:b w:val="0"/>
           <w:i w:val="0"/>
         </w:rPr>
-        <w:t>Beløpene er oppgitt av forbundskontoret 17. september 2026. Turneringsbestemmelsene (TBR 12.3.2) viste samme dag fortsatt 2 000 og 3 000 kr.</w:t>
+        <w:t>Kilde: turneringsbestemmelsene (TBR 12.3.2), bekreftet av forbundskontoret 17. september 2026.</w:t>
       </w:r>
     </w:p>
     <w:p>
@@ -6187,29 +6187,6 @@
           <w:b/>
           <w:i w:val="0"/>
         </w:rPr>
-        <w:t>Klubbkontingenten til forbundet.</w:t>
-      </w:r>
-      <w:r>
-        <w:rPr>
-          <w:b w:val="0"/>
-          <w:i w:val="0"/>
-        </w:rPr>
-        <w:t xml:space="preserve"> Forbundskontoret og TBR oppgir ulike beløp. Sjekk fakturaen klubben har fått.</w:t>
-      </w:r>
-    </w:p>
-    <w:p>
-      <w:pPr>
-        <w:pStyle w:val="ListNumber"/>
-        <w:numPr>
-          <w:ilvl w:val="0"/>
-          <w:numId w:val="11"/>
-        </w:numPr>
-      </w:pPr>
-      <w:r>
-        <w:rPr>
-          <w:b/>
-          <w:i w:val="0"/>
-        </w:rPr>
         <w:t>Om forbundet har egenkapital til nye lån</w:t>
       </w:r>
       <w:r>
@@ -6488,7 +6465,7 @@
           <w:b w:val="0"/>
           <w:i w:val="0"/>
         </w:rPr>
-        <w:t>Norges Biljardforbund, generalsekretær: e-post 17. september 2026 om klubbkontingent og lån</w:t>
+        <w:t>Norges Biljardforbund, generalsekretær: e-post 17. september 2026 om lån, og bekreftelse av at TBR 12.3.2 gjelder for klubbkontingenten</w:t>
       </w:r>
     </w:p>
     <w:p>

</xml_diff>